<commit_message>
Se actualizo la leyenda marzo2026
</commit_message>
<xml_diff>
--- a/polizador/secretariador/media/solicitud_exterior.docx
+++ b/polizador/secretariador/media/solicitud_exterior.docx
@@ -857,6 +857,16 @@
         </w:rPr>
         <w:t>Regístrese, comuníquese y archívese.</w:t>
       </w:r>
+    </w:p>
+    <w:p>
+      <w:pPr>
+        <w:spacing w:after="0" w:line="240" w:lineRule="auto"/>
+        <w:rPr>
+          <w:rFonts w:ascii="Arial" w:eastAsia="Arial" w:hAnsi="Arial" w:cs="Arial"/>
+          <w:sz w:val="24"/>
+          <w:szCs w:val="24"/>
+        </w:rPr>
+      </w:pPr>
     </w:p>
     <w:sectPr>
       <w:headerReference w:type="even" r:id="rId6"/>
@@ -1144,7 +1154,97 @@
         <w:sz w:val="24"/>
         <w:szCs w:val="24"/>
       </w:rPr>
-      <w:t xml:space="preserve"> “2026 - Año del 100° Aniversario de la sanción de la Ley de Derechos Civiles de la Mujer- ley nacional 11.357-”. </w:t>
+      <w:t xml:space="preserve"> “</w:t>
+    </w:r>
+    <w:proofErr w:type="gramStart"/>
+    <w:r>
+      <w:rPr>
+        <w:rFonts w:ascii="Arial" w:eastAsia="Arial" w:hAnsi="Arial" w:cs="Arial"/>
+        <w:sz w:val="24"/>
+        <w:szCs w:val="24"/>
+      </w:rPr>
+      <w:t>Marzo</w:t>
+    </w:r>
+    <w:proofErr w:type="gramEnd"/>
+    <w:r>
+      <w:rPr>
+        <w:rFonts w:ascii="Arial" w:eastAsia="Arial" w:hAnsi="Arial" w:cs="Arial"/>
+        <w:sz w:val="24"/>
+        <w:szCs w:val="24"/>
+      </w:rPr>
+      <w:t xml:space="preserve"> de </w:t>
+    </w:r>
+    <w:r>
+      <w:rPr>
+        <w:rFonts w:ascii="Arial" w:eastAsia="Arial" w:hAnsi="Arial" w:cs="Arial"/>
+        <w:sz w:val="24"/>
+        <w:szCs w:val="24"/>
+      </w:rPr>
+      <w:t xml:space="preserve">2026 </w:t>
+    </w:r>
+    <w:r>
+      <w:rPr>
+        <w:rFonts w:ascii="Arial" w:eastAsia="Arial" w:hAnsi="Arial" w:cs="Arial"/>
+        <w:sz w:val="24"/>
+        <w:szCs w:val="24"/>
+      </w:rPr>
+      <w:t>–</w:t>
+    </w:r>
+    <w:r>
+      <w:rPr>
+        <w:rFonts w:ascii="Arial" w:eastAsia="Arial" w:hAnsi="Arial" w:cs="Arial"/>
+        <w:sz w:val="24"/>
+        <w:szCs w:val="24"/>
+      </w:rPr>
+      <w:t xml:space="preserve"> </w:t>
+    </w:r>
+    <w:r>
+      <w:rPr>
+        <w:rFonts w:ascii="Arial" w:eastAsia="Arial" w:hAnsi="Arial" w:cs="Arial"/>
+        <w:sz w:val="24"/>
+        <w:szCs w:val="24"/>
+      </w:rPr>
+      <w:t>Mes del 50</w:t>
+    </w:r>
+    <w:r>
+      <w:rPr>
+        <w:rFonts w:ascii="Arial" w:eastAsia="Arial" w:hAnsi="Arial" w:cs="Arial"/>
+        <w:sz w:val="24"/>
+        <w:szCs w:val="24"/>
+      </w:rPr>
+      <w:t>° Aniversario de</w:t>
+    </w:r>
+    <w:r>
+      <w:rPr>
+        <w:rFonts w:ascii="Arial" w:eastAsia="Arial" w:hAnsi="Arial" w:cs="Arial"/>
+        <w:sz w:val="24"/>
+        <w:szCs w:val="24"/>
+      </w:rPr>
+      <w:t>l</w:t>
+    </w:r>
+    <w:r>
+      <w:rPr>
+        <w:rFonts w:ascii="Arial" w:eastAsia="Arial" w:hAnsi="Arial" w:cs="Arial"/>
+        <w:sz w:val="24"/>
+        <w:szCs w:val="24"/>
+      </w:rPr>
+      <w:t xml:space="preserve"> </w:t>
+    </w:r>
+    <w:r>
+      <w:rPr>
+        <w:rFonts w:ascii="Arial" w:eastAsia="Arial" w:hAnsi="Arial" w:cs="Arial"/>
+        <w:sz w:val="24"/>
+        <w:szCs w:val="24"/>
+      </w:rPr>
+      <w:t>Golpe de Estado Cívico-Militar de 1976. Memoria, Verdad y Justicia</w:t>
+    </w:r>
+    <w:r>
+      <w:rPr>
+        <w:rFonts w:ascii="Arial" w:eastAsia="Arial" w:hAnsi="Arial" w:cs="Arial"/>
+        <w:sz w:val="24"/>
+        <w:szCs w:val="24"/>
+      </w:rPr>
+      <w:t xml:space="preserve">-”. </w:t>
     </w:r>
     <w:r>
       <w:rPr>
@@ -1186,7 +1286,23 @@
         <w:sz w:val="24"/>
         <w:szCs w:val="24"/>
       </w:rPr>
-      <w:t xml:space="preserve"> 4202-A</w:t>
+      <w:t xml:space="preserve"> 42</w:t>
+    </w:r>
+    <w:r>
+      <w:rPr>
+        <w:rFonts w:ascii="Arial" w:eastAsia="Arial" w:hAnsi="Arial" w:cs="Arial"/>
+        <w:sz w:val="24"/>
+        <w:szCs w:val="24"/>
+      </w:rPr>
+      <w:t>27</w:t>
+    </w:r>
+    <w:r>
+      <w:rPr>
+        <w:rFonts w:ascii="Arial" w:eastAsia="Arial" w:hAnsi="Arial" w:cs="Arial"/>
+        <w:sz w:val="24"/>
+        <w:szCs w:val="24"/>
+      </w:rPr>
+      <w:t>-A</w:t>
     </w:r>
   </w:p>
   <w:p>

</xml_diff>

<commit_message>
Se actualizo la leyenda 2026
</commit_message>
<xml_diff>
--- a/polizador/secretariador/media/solicitud_exterior.docx
+++ b/polizador/secretariador/media/solicitud_exterior.docx
@@ -857,16 +857,6 @@
         </w:rPr>
         <w:t>Regístrese, comuníquese y archívese.</w:t>
       </w:r>
-    </w:p>
-    <w:p>
-      <w:pPr>
-        <w:spacing w:after="0" w:line="240" w:lineRule="auto"/>
-        <w:rPr>
-          <w:rFonts w:ascii="Arial" w:eastAsia="Arial" w:hAnsi="Arial" w:cs="Arial"/>
-          <w:sz w:val="24"/>
-          <w:szCs w:val="24"/>
-        </w:rPr>
-      </w:pPr>
     </w:p>
     <w:sectPr>
       <w:headerReference w:type="even" r:id="rId6"/>
@@ -1154,97 +1144,7 @@
         <w:sz w:val="24"/>
         <w:szCs w:val="24"/>
       </w:rPr>
-      <w:t xml:space="preserve"> “</w:t>
-    </w:r>
-    <w:proofErr w:type="gramStart"/>
-    <w:r>
-      <w:rPr>
-        <w:rFonts w:ascii="Arial" w:eastAsia="Arial" w:hAnsi="Arial" w:cs="Arial"/>
-        <w:sz w:val="24"/>
-        <w:szCs w:val="24"/>
-      </w:rPr>
-      <w:t>Marzo</w:t>
-    </w:r>
-    <w:proofErr w:type="gramEnd"/>
-    <w:r>
-      <w:rPr>
-        <w:rFonts w:ascii="Arial" w:eastAsia="Arial" w:hAnsi="Arial" w:cs="Arial"/>
-        <w:sz w:val="24"/>
-        <w:szCs w:val="24"/>
-      </w:rPr>
-      <w:t xml:space="preserve"> de </w:t>
-    </w:r>
-    <w:r>
-      <w:rPr>
-        <w:rFonts w:ascii="Arial" w:eastAsia="Arial" w:hAnsi="Arial" w:cs="Arial"/>
-        <w:sz w:val="24"/>
-        <w:szCs w:val="24"/>
-      </w:rPr>
-      <w:t xml:space="preserve">2026 </w:t>
-    </w:r>
-    <w:r>
-      <w:rPr>
-        <w:rFonts w:ascii="Arial" w:eastAsia="Arial" w:hAnsi="Arial" w:cs="Arial"/>
-        <w:sz w:val="24"/>
-        <w:szCs w:val="24"/>
-      </w:rPr>
-      <w:t>–</w:t>
-    </w:r>
-    <w:r>
-      <w:rPr>
-        <w:rFonts w:ascii="Arial" w:eastAsia="Arial" w:hAnsi="Arial" w:cs="Arial"/>
-        <w:sz w:val="24"/>
-        <w:szCs w:val="24"/>
-      </w:rPr>
-      <w:t xml:space="preserve"> </w:t>
-    </w:r>
-    <w:r>
-      <w:rPr>
-        <w:rFonts w:ascii="Arial" w:eastAsia="Arial" w:hAnsi="Arial" w:cs="Arial"/>
-        <w:sz w:val="24"/>
-        <w:szCs w:val="24"/>
-      </w:rPr>
-      <w:t>Mes del 50</w:t>
-    </w:r>
-    <w:r>
-      <w:rPr>
-        <w:rFonts w:ascii="Arial" w:eastAsia="Arial" w:hAnsi="Arial" w:cs="Arial"/>
-        <w:sz w:val="24"/>
-        <w:szCs w:val="24"/>
-      </w:rPr>
-      <w:t>° Aniversario de</w:t>
-    </w:r>
-    <w:r>
-      <w:rPr>
-        <w:rFonts w:ascii="Arial" w:eastAsia="Arial" w:hAnsi="Arial" w:cs="Arial"/>
-        <w:sz w:val="24"/>
-        <w:szCs w:val="24"/>
-      </w:rPr>
-      <w:t>l</w:t>
-    </w:r>
-    <w:r>
-      <w:rPr>
-        <w:rFonts w:ascii="Arial" w:eastAsia="Arial" w:hAnsi="Arial" w:cs="Arial"/>
-        <w:sz w:val="24"/>
-        <w:szCs w:val="24"/>
-      </w:rPr>
-      <w:t xml:space="preserve"> </w:t>
-    </w:r>
-    <w:r>
-      <w:rPr>
-        <w:rFonts w:ascii="Arial" w:eastAsia="Arial" w:hAnsi="Arial" w:cs="Arial"/>
-        <w:sz w:val="24"/>
-        <w:szCs w:val="24"/>
-      </w:rPr>
-      <w:t>Golpe de Estado Cívico-Militar de 1976. Memoria, Verdad y Justicia</w:t>
-    </w:r>
-    <w:r>
-      <w:rPr>
-        <w:rFonts w:ascii="Arial" w:eastAsia="Arial" w:hAnsi="Arial" w:cs="Arial"/>
-        <w:sz w:val="24"/>
-        <w:szCs w:val="24"/>
-      </w:rPr>
-      <w:t xml:space="preserve">-”. </w:t>
+      <w:t xml:space="preserve"> “2026 - Año del 100° Aniversario de la sanción de la Ley de Derechos Civiles de la Mujer- ley nacional 11.357-”. </w:t>
     </w:r>
     <w:r>
       <w:rPr>
@@ -1286,23 +1186,7 @@
         <w:sz w:val="24"/>
         <w:szCs w:val="24"/>
       </w:rPr>
-      <w:t xml:space="preserve"> 42</w:t>
-    </w:r>
-    <w:r>
-      <w:rPr>
-        <w:rFonts w:ascii="Arial" w:eastAsia="Arial" w:hAnsi="Arial" w:cs="Arial"/>
-        <w:sz w:val="24"/>
-        <w:szCs w:val="24"/>
-      </w:rPr>
-      <w:t>27</w:t>
-    </w:r>
-    <w:r>
-      <w:rPr>
-        <w:rFonts w:ascii="Arial" w:eastAsia="Arial" w:hAnsi="Arial" w:cs="Arial"/>
-        <w:sz w:val="24"/>
-        <w:szCs w:val="24"/>
-      </w:rPr>
-      <w:t>-A</w:t>
+      <w:t xml:space="preserve"> 4202-A</w:t>
     </w:r>
   </w:p>
   <w:p>

</xml_diff>

<commit_message>
Corregido error de tipeo en las plantillas de las solicitudes
</commit_message>
<xml_diff>
--- a/polizador/secretariador/media/solicitud_exterior.docx
+++ b/polizador/secretariador/media/solicitud_exterior.docx
@@ -27,53 +27,7 @@
           <w:sz w:val="24"/>
           <w:szCs w:val="24"/>
         </w:rPr>
-        <w:t xml:space="preserve">La Actuación Electrónica </w:t>
-      </w:r>
-      <w:proofErr w:type="spellStart"/>
-      <w:r>
-        <w:rPr>
-          <w:rFonts w:ascii="Arial" w:eastAsia="Arial" w:hAnsi="Arial" w:cs="Arial"/>
-          <w:sz w:val="24"/>
-          <w:szCs w:val="24"/>
-        </w:rPr>
-        <w:t>Nº</w:t>
-      </w:r>
-      <w:proofErr w:type="spellEnd"/>
-      <w:r>
-        <w:rPr>
-          <w:rFonts w:ascii="Arial" w:eastAsia="Arial" w:hAnsi="Arial" w:cs="Arial"/>
-          <w:sz w:val="24"/>
-          <w:szCs w:val="24"/>
-        </w:rPr>
-        <w:t>{{</w:t>
-      </w:r>
-      <w:proofErr w:type="spellStart"/>
-      <w:proofErr w:type="gramStart"/>
-      <w:r>
-        <w:rPr>
-          <w:rFonts w:ascii="Arial" w:eastAsia="Arial" w:hAnsi="Arial" w:cs="Arial"/>
-          <w:sz w:val="24"/>
-          <w:szCs w:val="24"/>
-        </w:rPr>
-        <w:t>actuacion.solicitud</w:t>
-      </w:r>
-      <w:proofErr w:type="gramEnd"/>
-      <w:r>
-        <w:rPr>
-          <w:rFonts w:ascii="Arial" w:eastAsia="Arial" w:hAnsi="Arial" w:cs="Arial"/>
-          <w:sz w:val="24"/>
-          <w:szCs w:val="24"/>
-        </w:rPr>
-        <w:t>_actuacion</w:t>
-      </w:r>
-      <w:proofErr w:type="spellEnd"/>
-      <w:r>
-        <w:rPr>
-          <w:rFonts w:ascii="Arial" w:eastAsia="Arial" w:hAnsi="Arial" w:cs="Arial"/>
-          <w:sz w:val="24"/>
-          <w:szCs w:val="24"/>
-        </w:rPr>
-        <w:t xml:space="preserve">}}; y </w:t>
+        <w:t xml:space="preserve">La Actuación Electrónica Nº{{actuacion.solicitud_actuacion}}; y </w:t>
       </w:r>
     </w:p>
     <w:p>
@@ -113,25 +67,7 @@
           <w:sz w:val="24"/>
           <w:szCs w:val="24"/>
         </w:rPr>
-        <w:t>{{</w:t>
-      </w:r>
-      <w:proofErr w:type="spellStart"/>
-      <w:r>
-        <w:rPr>
-          <w:rFonts w:ascii="Arial" w:eastAsia="Arial" w:hAnsi="Arial" w:cs="Arial"/>
-          <w:sz w:val="24"/>
-          <w:szCs w:val="24"/>
-        </w:rPr>
-        <w:t>parrafo_uno</w:t>
-      </w:r>
-      <w:proofErr w:type="spellEnd"/>
-      <w:r>
-        <w:rPr>
-          <w:rFonts w:ascii="Arial" w:eastAsia="Arial" w:hAnsi="Arial" w:cs="Arial"/>
-          <w:sz w:val="24"/>
-          <w:szCs w:val="24"/>
-        </w:rPr>
-        <w:t>}}</w:t>
+        <w:t>{{parrafo_uno}}</w:t>
       </w:r>
     </w:p>
     <w:p>
@@ -151,25 +87,7 @@
           <w:sz w:val="24"/>
           <w:szCs w:val="24"/>
         </w:rPr>
-        <w:t>{{</w:t>
-      </w:r>
-      <w:proofErr w:type="spellStart"/>
-      <w:r>
-        <w:rPr>
-          <w:rFonts w:ascii="Arial" w:eastAsia="Arial" w:hAnsi="Arial" w:cs="Arial"/>
-          <w:sz w:val="24"/>
-          <w:szCs w:val="24"/>
-        </w:rPr>
-        <w:t>parrafo_dos</w:t>
-      </w:r>
-      <w:proofErr w:type="spellEnd"/>
-      <w:r>
-        <w:rPr>
-          <w:rFonts w:ascii="Arial" w:eastAsia="Arial" w:hAnsi="Arial" w:cs="Arial"/>
-          <w:sz w:val="24"/>
-          <w:szCs w:val="24"/>
-        </w:rPr>
-        <w:t>}}</w:t>
+        <w:t>{{parrafo_dos}}</w:t>
       </w:r>
     </w:p>
     <w:p>
@@ -189,25 +107,7 @@
           <w:sz w:val="24"/>
           <w:szCs w:val="24"/>
         </w:rPr>
-        <w:t>{{</w:t>
-      </w:r>
-      <w:proofErr w:type="spellStart"/>
-      <w:r>
-        <w:rPr>
-          <w:rFonts w:ascii="Arial" w:eastAsia="Arial" w:hAnsi="Arial" w:cs="Arial"/>
-          <w:sz w:val="24"/>
-          <w:szCs w:val="24"/>
-        </w:rPr>
-        <w:t>parrafo_tres</w:t>
-      </w:r>
-      <w:proofErr w:type="spellEnd"/>
-      <w:r>
-        <w:rPr>
-          <w:rFonts w:ascii="Arial" w:eastAsia="Arial" w:hAnsi="Arial" w:cs="Arial"/>
-          <w:sz w:val="24"/>
-          <w:szCs w:val="24"/>
-        </w:rPr>
-        <w:t>}}</w:t>
+        <w:t>{{parrafo_tres}}</w:t>
       </w:r>
     </w:p>
     <w:p>
@@ -227,81 +127,7 @@
           <w:sz w:val="24"/>
           <w:szCs w:val="24"/>
         </w:rPr>
-        <w:t>{%</w:t>
-      </w:r>
-      <w:proofErr w:type="spellStart"/>
-      <w:r>
-        <w:rPr>
-          <w:rFonts w:ascii="Arial" w:eastAsia="Arial" w:hAnsi="Arial" w:cs="Arial"/>
-          <w:sz w:val="24"/>
-          <w:szCs w:val="24"/>
-        </w:rPr>
-        <w:t>if</w:t>
-      </w:r>
-      <w:proofErr w:type="spellEnd"/>
-      <w:r>
-        <w:rPr>
-          <w:rFonts w:ascii="Arial" w:eastAsia="Arial" w:hAnsi="Arial" w:cs="Arial"/>
-          <w:sz w:val="24"/>
-          <w:szCs w:val="24"/>
-        </w:rPr>
-        <w:t xml:space="preserve"> </w:t>
-      </w:r>
-      <w:proofErr w:type="spellStart"/>
-      <w:proofErr w:type="gramStart"/>
-      <w:r>
-        <w:rPr>
-          <w:rFonts w:ascii="Arial" w:eastAsia="Arial" w:hAnsi="Arial" w:cs="Arial"/>
-          <w:sz w:val="24"/>
-          <w:szCs w:val="24"/>
-        </w:rPr>
-        <w:t>actuacion.solicitud</w:t>
-      </w:r>
-      <w:proofErr w:type="gramEnd"/>
-      <w:r>
-        <w:rPr>
-          <w:rFonts w:ascii="Arial" w:eastAsia="Arial" w:hAnsi="Arial" w:cs="Arial"/>
-          <w:sz w:val="24"/>
-          <w:szCs w:val="24"/>
-        </w:rPr>
-        <w:t>_dia_inhabil</w:t>
-      </w:r>
-      <w:proofErr w:type="spellEnd"/>
-      <w:proofErr w:type="gramStart"/>
-      <w:r>
-        <w:rPr>
-          <w:rFonts w:ascii="Arial" w:eastAsia="Arial" w:hAnsi="Arial" w:cs="Arial"/>
-          <w:sz w:val="24"/>
-          <w:szCs w:val="24"/>
-        </w:rPr>
-        <w:t>%}{</w:t>
-      </w:r>
-      <w:proofErr w:type="gramEnd"/>
-      <w:r>
-        <w:rPr>
-          <w:rFonts w:ascii="Arial" w:eastAsia="Arial" w:hAnsi="Arial" w:cs="Arial"/>
-          <w:sz w:val="24"/>
-          <w:szCs w:val="24"/>
-        </w:rPr>
-        <w:t>{</w:t>
-      </w:r>
-      <w:proofErr w:type="spellStart"/>
-      <w:r>
-        <w:rPr>
-          <w:rFonts w:ascii="Arial" w:eastAsia="Arial" w:hAnsi="Arial" w:cs="Arial"/>
-          <w:sz w:val="24"/>
-          <w:szCs w:val="24"/>
-        </w:rPr>
-        <w:t>parrafo_cuatro</w:t>
-      </w:r>
-      <w:proofErr w:type="spellEnd"/>
-      <w:r>
-        <w:rPr>
-          <w:rFonts w:ascii="Arial" w:eastAsia="Arial" w:hAnsi="Arial" w:cs="Arial"/>
-          <w:sz w:val="24"/>
-          <w:szCs w:val="24"/>
-        </w:rPr>
-        <w:t>}}</w:t>
+        <w:t>{%if actuacion.solicitud_dia_inhabil%}{{parrafo_cuatro}}</w:t>
       </w:r>
     </w:p>
     <w:p>
@@ -321,35 +147,39 @@
           <w:sz w:val="24"/>
           <w:szCs w:val="24"/>
         </w:rPr>
-        <w:t>{%</w:t>
-      </w:r>
-      <w:proofErr w:type="spellStart"/>
-      <w:r>
-        <w:rPr>
-          <w:rFonts w:ascii="Arial" w:eastAsia="Arial" w:hAnsi="Arial" w:cs="Arial"/>
-          <w:sz w:val="24"/>
-          <w:szCs w:val="24"/>
-        </w:rPr>
-        <w:t>endif</w:t>
-      </w:r>
-      <w:proofErr w:type="spellEnd"/>
-      <w:proofErr w:type="gramStart"/>
-      <w:r>
-        <w:rPr>
-          <w:rFonts w:ascii="Arial" w:eastAsia="Arial" w:hAnsi="Arial" w:cs="Arial"/>
-          <w:sz w:val="24"/>
-          <w:szCs w:val="24"/>
-        </w:rPr>
-        <w:t>%}Que</w:t>
-      </w:r>
-      <w:proofErr w:type="gramEnd"/>
-      <w:r>
-        <w:rPr>
-          <w:rFonts w:ascii="Arial" w:eastAsia="Arial" w:hAnsi="Arial" w:cs="Arial"/>
-          <w:sz w:val="24"/>
-          <w:szCs w:val="24"/>
-        </w:rPr>
-        <w:t xml:space="preserve"> conforme a lo establecido en Memorándum Nº50/2024 de la Contaduría General de la Provincia, “si los agentes no efectuasen la rendición y/o reintegro del excedente del presente anticipo dentro del plazo reglamentario, autorizan expresamente a retener de sus haberes los importes recibidos y/o reintegrados”;</w:t>
+        <w:t>{%endif%}Que conforme a lo establecido en Memorándum Nº</w:t>
+      </w:r>
+      <w:r>
+        <w:rPr>
+          <w:rFonts w:ascii="Arial" w:eastAsia="Arial" w:hAnsi="Arial" w:cs="Arial"/>
+          <w:sz w:val="24"/>
+          <w:szCs w:val="24"/>
+        </w:rPr>
+        <w:t>0</w:t>
+      </w:r>
+      <w:r>
+        <w:rPr>
+          <w:rFonts w:ascii="Arial" w:eastAsia="Arial" w:hAnsi="Arial" w:cs="Arial"/>
+          <w:sz w:val="24"/>
+          <w:szCs w:val="24"/>
+        </w:rPr>
+        <w:t>50/20</w:t>
+      </w:r>
+      <w:r>
+        <w:rPr>
+          <w:rFonts w:ascii="Arial" w:eastAsia="Arial" w:hAnsi="Arial" w:cs="Arial"/>
+          <w:sz w:val="24"/>
+          <w:szCs w:val="24"/>
+        </w:rPr>
+        <w:t>1</w:t>
+      </w:r>
+      <w:r>
+        <w:rPr>
+          <w:rFonts w:ascii="Arial" w:eastAsia="Arial" w:hAnsi="Arial" w:cs="Arial"/>
+          <w:sz w:val="24"/>
+          <w:szCs w:val="24"/>
+        </w:rPr>
+        <w:t>4 de la Contaduría General de la Provincia, “si los agentes no efectuasen la rendición y/o reintegro del excedente del presente anticipo dentro del plazo reglamentario, autorizan expresamente a retener de sus haberes los importes recibidos y/o reintegrados”;</w:t>
       </w:r>
     </w:p>
     <w:p>
@@ -459,25 +289,7 @@
           <w:sz w:val="24"/>
           <w:szCs w:val="24"/>
         </w:rPr>
-        <w:t>{{</w:t>
-      </w:r>
-      <w:proofErr w:type="spellStart"/>
-      <w:r>
-        <w:rPr>
-          <w:rFonts w:ascii="Arial" w:eastAsia="Arial" w:hAnsi="Arial" w:cs="Arial"/>
-          <w:sz w:val="24"/>
-          <w:szCs w:val="24"/>
-        </w:rPr>
-        <w:t>articulo_uno</w:t>
-      </w:r>
-      <w:proofErr w:type="spellEnd"/>
-      <w:r>
-        <w:rPr>
-          <w:rFonts w:ascii="Arial" w:eastAsia="Arial" w:hAnsi="Arial" w:cs="Arial"/>
-          <w:sz w:val="24"/>
-          <w:szCs w:val="24"/>
-        </w:rPr>
-        <w:t>}}</w:t>
+        <w:t>{{articulo_uno}}</w:t>
       </w:r>
     </w:p>
     <w:p>
@@ -555,9 +367,8 @@
           <w:sz w:val="24"/>
           <w:szCs w:val="24"/>
         </w:rPr>
-        <w:t xml:space="preserve">{% </w:t>
-      </w:r>
-      <w:proofErr w:type="spellStart"/>
+        <w:t>{% for agente in articulo_dos%}</w:t>
+      </w:r>
       <w:r>
         <w:rPr>
           <w:rFonts w:ascii="Arial" w:hAnsi="Arial" w:cs="Arial"/>
@@ -565,9 +376,8 @@
           <w:sz w:val="24"/>
           <w:szCs w:val="24"/>
         </w:rPr>
-        <w:t>for</w:t>
-      </w:r>
-      <w:proofErr w:type="spellEnd"/>
+        <w:t>{{agente[0]}}</w:t>
+      </w:r>
       <w:r>
         <w:rPr>
           <w:rFonts w:ascii="Arial" w:hAnsi="Arial" w:cs="Arial"/>
@@ -575,9 +385,9 @@
           <w:sz w:val="24"/>
           <w:szCs w:val="24"/>
         </w:rPr>
-        <w:t xml:space="preserve"> agente in </w:t>
-      </w:r>
-      <w:proofErr w:type="spellStart"/>
+        <w:tab/>
+        <w:t>${{</w:t>
+      </w:r>
       <w:r>
         <w:rPr>
           <w:rFonts w:ascii="Arial" w:hAnsi="Arial" w:cs="Arial"/>
@@ -585,67 +395,7 @@
           <w:sz w:val="24"/>
           <w:szCs w:val="24"/>
         </w:rPr>
-        <w:t>articulo_dos</w:t>
-      </w:r>
-      <w:proofErr w:type="spellEnd"/>
-      <w:proofErr w:type="gramStart"/>
-      <w:r>
-        <w:rPr>
-          <w:rFonts w:ascii="Arial" w:hAnsi="Arial" w:cs="Arial"/>
-          <w:bCs/>
-          <w:sz w:val="24"/>
-          <w:szCs w:val="24"/>
-        </w:rPr>
-        <w:t>%}</w:t>
-      </w:r>
-      <w:r>
-        <w:rPr>
-          <w:rFonts w:ascii="Arial" w:hAnsi="Arial" w:cs="Arial"/>
-          <w:bCs/>
-          <w:sz w:val="24"/>
-          <w:szCs w:val="24"/>
-        </w:rPr>
-        <w:t>{</w:t>
-      </w:r>
-      <w:proofErr w:type="gramEnd"/>
-      <w:r>
-        <w:rPr>
-          <w:rFonts w:ascii="Arial" w:hAnsi="Arial" w:cs="Arial"/>
-          <w:bCs/>
-          <w:sz w:val="24"/>
-          <w:szCs w:val="24"/>
-        </w:rPr>
-        <w:t>{agente[0]}}</w:t>
-      </w:r>
-      <w:r>
-        <w:rPr>
-          <w:rFonts w:ascii="Arial" w:hAnsi="Arial" w:cs="Arial"/>
-          <w:bCs/>
-          <w:sz w:val="24"/>
-          <w:szCs w:val="24"/>
-        </w:rPr>
-        <w:tab/>
-        <w:t>${{</w:t>
-      </w:r>
-      <w:proofErr w:type="gramStart"/>
-      <w:r>
-        <w:rPr>
-          <w:rFonts w:ascii="Arial" w:hAnsi="Arial" w:cs="Arial"/>
-          <w:bCs/>
-          <w:sz w:val="24"/>
-          <w:szCs w:val="24"/>
-        </w:rPr>
-        <w:t>agente[</w:t>
-      </w:r>
-      <w:proofErr w:type="gramEnd"/>
-      <w:r>
-        <w:rPr>
-          <w:rFonts w:ascii="Arial" w:hAnsi="Arial" w:cs="Arial"/>
-          <w:bCs/>
-          <w:sz w:val="24"/>
-          <w:szCs w:val="24"/>
-        </w:rPr>
-        <w:t>1]</w:t>
+        <w:t>agente[1]</w:t>
       </w:r>
       <w:r>
         <w:rPr>
@@ -679,27 +429,7 @@
           <w:sz w:val="24"/>
           <w:szCs w:val="24"/>
         </w:rPr>
-        <w:t>{{</w:t>
-      </w:r>
-      <w:proofErr w:type="gramStart"/>
-      <w:r>
-        <w:rPr>
-          <w:rFonts w:ascii="Arial" w:hAnsi="Arial" w:cs="Arial"/>
-          <w:bCs/>
-          <w:sz w:val="24"/>
-          <w:szCs w:val="24"/>
-        </w:rPr>
-        <w:t>agente[</w:t>
-      </w:r>
-      <w:proofErr w:type="gramEnd"/>
-      <w:r>
-        <w:rPr>
-          <w:rFonts w:ascii="Arial" w:hAnsi="Arial" w:cs="Arial"/>
-          <w:bCs/>
-          <w:sz w:val="24"/>
-          <w:szCs w:val="24"/>
-        </w:rPr>
-        <w:t>2]}}</w:t>
+        <w:t>{{agente[2]}}</w:t>
       </w:r>
     </w:p>
     <w:p>
@@ -723,28 +453,7 @@
           <w:sz w:val="24"/>
           <w:szCs w:val="24"/>
         </w:rPr>
-        <w:t>{%</w:t>
-      </w:r>
-      <w:proofErr w:type="spellStart"/>
-      <w:r>
-        <w:rPr>
-          <w:rFonts w:ascii="Arial" w:hAnsi="Arial" w:cs="Arial"/>
-          <w:bCs/>
-          <w:sz w:val="24"/>
-          <w:szCs w:val="24"/>
-        </w:rPr>
-        <w:t>endfor</w:t>
-      </w:r>
-      <w:proofErr w:type="spellEnd"/>
-      <w:proofErr w:type="gramStart"/>
-      <w:r>
-        <w:rPr>
-          <w:rFonts w:ascii="Arial" w:hAnsi="Arial" w:cs="Arial"/>
-          <w:bCs/>
-          <w:sz w:val="24"/>
-          <w:szCs w:val="24"/>
-        </w:rPr>
-        <w:t>%}</w:t>
+        <w:t>{%endfor%}</w:t>
       </w:r>
       <w:r>
         <w:rPr>
@@ -753,17 +462,7 @@
           <w:sz w:val="24"/>
           <w:szCs w:val="24"/>
         </w:rPr>
-        <w:t>Artículo</w:t>
-      </w:r>
-      <w:proofErr w:type="gramEnd"/>
-      <w:r>
-        <w:rPr>
-          <w:rFonts w:ascii="Arial" w:eastAsia="Arial" w:hAnsi="Arial" w:cs="Arial"/>
-          <w:b/>
-          <w:sz w:val="24"/>
-          <w:szCs w:val="24"/>
-        </w:rPr>
-        <w:t xml:space="preserve"> 3°:</w:t>
+        <w:t>Artículo 3°:</w:t>
       </w:r>
       <w:r>
         <w:rPr>
@@ -1168,25 +867,7 @@
         <w:sz w:val="24"/>
         <w:szCs w:val="24"/>
       </w:rPr>
-      <w:t xml:space="preserve"> </w:t>
-    </w:r>
-    <w:proofErr w:type="spellStart"/>
-    <w:r>
-      <w:rPr>
-        <w:rFonts w:ascii="Arial" w:eastAsia="Arial" w:hAnsi="Arial" w:cs="Arial"/>
-        <w:sz w:val="24"/>
-        <w:szCs w:val="24"/>
-      </w:rPr>
-      <w:t>N°</w:t>
-    </w:r>
-    <w:proofErr w:type="spellEnd"/>
-    <w:r>
-      <w:rPr>
-        <w:rFonts w:ascii="Arial" w:eastAsia="Arial" w:hAnsi="Arial" w:cs="Arial"/>
-        <w:sz w:val="24"/>
-        <w:szCs w:val="24"/>
-      </w:rPr>
-      <w:t xml:space="preserve"> 4202-A</w:t>
+      <w:t xml:space="preserve"> N° 4202-A</w:t>
     </w:r>
   </w:p>
   <w:p>

</xml_diff>